<commit_message>
Run full pipeline on trial data; update scripts and manuscript with real results
Pipeline output (52-sample pilot subset, user-data/Trial_1_Project_Data):
- data/processed/let7_rpm.csv: 572 rows, 11 let-7 members x 52 samples
- results/tables/ttest_normal_vs_cancer.csv: let-7b top (p=4.18e-5, FC=2.96)
- results/tables/ttest_let7b_stages.csv: all stages vs Normal significant
- results/tables/svm_metrics.csv: single-feature SVM accuracy=0.909, AUC=1.000
- results/tables/multi_feature_metrics.csv: SVM-RBF/LR perfect on pilot test set
- results/tables/feature_importance.csv: let-7b top (0.069), let-7e second (0.030)
- results/figures/fig1-5: box plot, violin, ROC curves, feature importance

Script fixes:
- src/train_svm.py, src/train_svm_multi.py: replace deprecated SVC(probability=True)
  with CalibratedClassifierCV(SVC(), ensemble=False) for sklearn 1.9 compatibility

Manuscript: paper/let7_multi_feature_manuscript.docx updated with pilot results
</commit_message>
<xml_diff>
--- a/paper/let7_multi_feature_manuscript.docx
+++ b/paper/let7_multi_feature_manuscript.docx
@@ -762,7 +762,7 @@
                 <w:sz w:val="20"/>
                 <w:szCs w:val="20"/>
               </w:rPr>
-              <w:t xml:space="preserve">[X.XXX]</w:t>
+              <w:t xml:space="preserve">1.000</w:t>
             </w:r>
           </w:p>
         </w:tc>
@@ -781,7 +781,7 @@
                 <w:sz w:val="20"/>
                 <w:szCs w:val="20"/>
               </w:rPr>
-              <w:t xml:space="preserve">[X.XXX]</w:t>
+              <w:t xml:space="preserve">1.000</w:t>
             </w:r>
           </w:p>
         </w:tc>
@@ -800,7 +800,7 @@
                 <w:sz w:val="20"/>
                 <w:szCs w:val="20"/>
               </w:rPr>
-              <w:t xml:space="preserve">[X.XXX]</w:t>
+              <w:t xml:space="preserve">1.000</w:t>
             </w:r>
           </w:p>
         </w:tc>
@@ -819,7 +819,7 @@
                 <w:sz w:val="20"/>
                 <w:szCs w:val="20"/>
               </w:rPr>
-              <w:t xml:space="preserve">[X.XXX]</w:t>
+              <w:t xml:space="preserve">1.000</w:t>
             </w:r>
           </w:p>
         </w:tc>
@@ -878,7 +878,7 @@
                 <w:sz w:val="20"/>
                 <w:szCs w:val="20"/>
               </w:rPr>
-              <w:t xml:space="preserve">[X.XXX]</w:t>
+              <w:t xml:space="preserve">1.000</w:t>
             </w:r>
           </w:p>
         </w:tc>
@@ -897,7 +897,7 @@
                 <w:sz w:val="20"/>
                 <w:szCs w:val="20"/>
               </w:rPr>
-              <w:t xml:space="preserve">[X.XXX]</w:t>
+              <w:t xml:space="preserve">1.000</w:t>
             </w:r>
           </w:p>
         </w:tc>
@@ -916,7 +916,7 @@
                 <w:sz w:val="20"/>
                 <w:szCs w:val="20"/>
               </w:rPr>
-              <w:t xml:space="preserve">[X.XXX]</w:t>
+              <w:t xml:space="preserve">1.000</w:t>
             </w:r>
           </w:p>
         </w:tc>
@@ -935,7 +935,7 @@
                 <w:sz w:val="20"/>
                 <w:szCs w:val="20"/>
               </w:rPr>
-              <w:t xml:space="preserve">[X.XXX]</w:t>
+              <w:t xml:space="preserve">1.000</w:t>
             </w:r>
           </w:p>
         </w:tc>
@@ -994,7 +994,7 @@
                 <w:sz w:val="20"/>
                 <w:szCs w:val="20"/>
               </w:rPr>
-              <w:t xml:space="preserve">[X.XXX]</w:t>
+              <w:t xml:space="preserve">0.909</w:t>
             </w:r>
           </w:p>
         </w:tc>
@@ -1013,7 +1013,7 @@
                 <w:sz w:val="20"/>
                 <w:szCs w:val="20"/>
               </w:rPr>
-              <w:t xml:space="preserve">[X.XXX]</w:t>
+              <w:t xml:space="preserve">1.000</w:t>
             </w:r>
           </w:p>
         </w:tc>
@@ -1032,7 +1032,7 @@
                 <w:sz w:val="20"/>
                 <w:szCs w:val="20"/>
               </w:rPr>
-              <w:t xml:space="preserve">[X.XXX]</w:t>
+              <w:t xml:space="preserve">0.889</w:t>
             </w:r>
           </w:p>
         </w:tc>
@@ -1051,7 +1051,7 @@
                 <w:sz w:val="20"/>
                 <w:szCs w:val="20"/>
               </w:rPr>
-              <w:t xml:space="preserve">[X.XXX]</w:t>
+              <w:t xml:space="preserve">1.000</w:t>
             </w:r>
           </w:p>
         </w:tc>
@@ -1110,7 +1110,7 @@
                 <w:sz w:val="20"/>
                 <w:szCs w:val="20"/>
               </w:rPr>
-              <w:t xml:space="preserve">[X.XXX]</w:t>
+              <w:t xml:space="preserve">0.909</w:t>
             </w:r>
           </w:p>
         </w:tc>
@@ -1129,7 +1129,7 @@
                 <w:sz w:val="20"/>
                 <w:szCs w:val="20"/>
               </w:rPr>
-              <w:t xml:space="preserve">[X.XXX]</w:t>
+              <w:t xml:space="preserve">1.000</w:t>
             </w:r>
           </w:p>
         </w:tc>
@@ -1148,7 +1148,7 @@
                 <w:sz w:val="20"/>
                 <w:szCs w:val="20"/>
               </w:rPr>
-              <w:t xml:space="preserve">[X.XXX]</w:t>
+              <w:t xml:space="preserve">0.889</w:t>
             </w:r>
           </w:p>
         </w:tc>
@@ -1167,7 +1167,7 @@
                 <w:sz w:val="20"/>
                 <w:szCs w:val="20"/>
               </w:rPr>
-              <w:t xml:space="preserve">[X.XXX]</w:t>
+              <w:t xml:space="preserve">1.000</w:t>
             </w:r>
           </w:p>
         </w:tc>
@@ -1197,7 +1197,7 @@
           <w:sz w:val="24"/>
           <w:szCs w:val="24"/>
         </w:rPr>
-        <w:t xml:space="preserve">The best-performing multi-feature classifier was [CLASSIFIER NAME] with a ROC-AUC of [X.XXX], compared to [X.XXX] for the corrected single-feature baseline—an absolute improvement of [X.XXX] AUC points. ROC curves for all classifiers are shown in Figure 4.</w:t>
+        <w:t xml:space="preserve">Note: Results in Table 1 are from the 52-sample pilot subset (10 Normal, 42 Cancer). The test set comprised 11 samples (2 Normal, 9 Cancer). The perfect ROC-AUC of 1.000 across all classifiers reflects the strong separation of let-7 expression between tissue types and the small test set; results from the full 557-sample TCGA-KIRC dataset are expected to be more conservative. The best-performing multi-feature classifiers (SVM-RBF and Logistic Regression) achieved perfect accuracy on this pilot test set, compared to 0.909 for the corrected single-feature baseline. ROC curves for all classifiers are shown in Figure 4.</w:t>
       </w:r>
     </w:p>
     <w:p>
@@ -1376,7 +1376,7 @@
                 <w:sz w:val="20"/>
                 <w:szCs w:val="20"/>
               </w:rPr>
-              <w:t xml:space="preserve">Direction in ccRCC (Study 1)</w:t>
+              <w:t xml:space="preserve">Direction in pilot (p-value)</w:t>
             </w:r>
           </w:p>
         </w:tc>
@@ -1416,7 +1416,7 @@
                 <w:sz w:val="20"/>
                 <w:szCs w:val="20"/>
               </w:rPr>
-              <w:t xml:space="preserve">[X.XXXX]</w:t>
+              <w:t xml:space="preserve">0.0685</w:t>
             </w:r>
           </w:p>
         </w:tc>
@@ -1435,7 +1435,7 @@
                 <w:sz w:val="20"/>
                 <w:szCs w:val="20"/>
               </w:rPr>
-              <w:t xml:space="preserve">[X.XXXX]</w:t>
+              <w:t xml:space="preserve">0.0652</w:t>
             </w:r>
           </w:p>
         </w:tc>
@@ -1454,7 +1454,7 @@
                 <w:sz w:val="20"/>
                 <w:szCs w:val="20"/>
               </w:rPr>
-              <w:t xml:space="preserve">↑ (p = 1.18×10⁻⁷)</w:t>
+              <w:t xml:space="preserve">↑ (p = 4.18×10⁻⁵)</w:t>
             </w:r>
           </w:p>
         </w:tc>
@@ -1475,7 +1475,7 @@
                 <w:sz w:val="20"/>
                 <w:szCs w:val="20"/>
               </w:rPr>
-              <w:t xml:space="preserve">hsa-let-7f-1</w:t>
+              <w:t xml:space="preserve">hsa-let-7e</w:t>
             </w:r>
           </w:p>
         </w:tc>
@@ -1494,7 +1494,7 @@
                 <w:sz w:val="20"/>
                 <w:szCs w:val="20"/>
               </w:rPr>
-              <w:t xml:space="preserve">[X.XXXX]</w:t>
+              <w:t xml:space="preserve">0.0296</w:t>
             </w:r>
           </w:p>
         </w:tc>
@@ -1513,7 +1513,7 @@
                 <w:sz w:val="20"/>
                 <w:szCs w:val="20"/>
               </w:rPr>
-              <w:t xml:space="preserve">[X.XXXX]</w:t>
+              <w:t xml:space="preserve">0.0399</w:t>
             </w:r>
           </w:p>
         </w:tc>
@@ -1532,7 +1532,7 @@
                 <w:sz w:val="20"/>
                 <w:szCs w:val="20"/>
               </w:rPr>
-              <w:t xml:space="preserve">↑ (significant)</w:t>
+              <w:t xml:space="preserve">↓ (p = 1.92×10⁻³)</w:t>
             </w:r>
           </w:p>
         </w:tc>
@@ -1553,7 +1553,7 @@
                 <w:sz w:val="20"/>
                 <w:szCs w:val="20"/>
               </w:rPr>
-              <w:t xml:space="preserve">hsa-let-7f-2</w:t>
+              <w:t xml:space="preserve">hsa-let-7g</w:t>
             </w:r>
           </w:p>
         </w:tc>
@@ -1572,7 +1572,7 @@
                 <w:sz w:val="20"/>
                 <w:szCs w:val="20"/>
               </w:rPr>
-              <w:t xml:space="preserve">[X.XXXX]</w:t>
+              <w:t xml:space="preserve">0.0056</w:t>
             </w:r>
           </w:p>
         </w:tc>
@@ -1591,7 +1591,7 @@
                 <w:sz w:val="20"/>
                 <w:szCs w:val="20"/>
               </w:rPr>
-              <w:t xml:space="preserve">[X.XXXX]</w:t>
+              <w:t xml:space="preserve">0.0167</w:t>
             </w:r>
           </w:p>
         </w:tc>
@@ -1610,7 +1610,7 @@
                 <w:sz w:val="20"/>
                 <w:szCs w:val="20"/>
               </w:rPr>
-              <w:t xml:space="preserve">↑ (significant)</w:t>
+              <w:t xml:space="preserve">↑ (p = 3.23×10⁻³)</w:t>
             </w:r>
           </w:p>
         </w:tc>
@@ -1631,7 +1631,7 @@
                 <w:sz w:val="20"/>
                 <w:szCs w:val="20"/>
               </w:rPr>
-              <w:t xml:space="preserve">hsa-let-7g</w:t>
+              <w:t xml:space="preserve">hsa-let-7a-1</w:t>
             </w:r>
           </w:p>
         </w:tc>
@@ -1650,7 +1650,7 @@
                 <w:sz w:val="20"/>
                 <w:szCs w:val="20"/>
               </w:rPr>
-              <w:t xml:space="preserve">[X.XXXX]</w:t>
+              <w:t xml:space="preserve">0.0000</w:t>
             </w:r>
           </w:p>
         </w:tc>
@@ -1669,7 +1669,7 @@
                 <w:sz w:val="20"/>
                 <w:szCs w:val="20"/>
               </w:rPr>
-              <w:t xml:space="preserve">[X.XXXX]</w:t>
+              <w:t xml:space="preserve">0.0000</w:t>
             </w:r>
           </w:p>
         </w:tc>
@@ -1688,7 +1688,7 @@
                 <w:sz w:val="20"/>
                 <w:szCs w:val="20"/>
               </w:rPr>
-              <w:t xml:space="preserve">↑ (significant)</w:t>
+              <w:t xml:space="preserve">↑ (p = 0.308, n.s.)</w:t>
             </w:r>
           </w:p>
         </w:tc>
@@ -1709,7 +1709,7 @@
                 <w:sz w:val="20"/>
                 <w:szCs w:val="20"/>
               </w:rPr>
-              <w:t xml:space="preserve">hsa-let-7i</w:t>
+              <w:t xml:space="preserve">hsa-let-7a-2</w:t>
             </w:r>
           </w:p>
         </w:tc>
@@ -1728,7 +1728,7 @@
                 <w:sz w:val="20"/>
                 <w:szCs w:val="20"/>
               </w:rPr>
-              <w:t xml:space="preserve">[X.XXXX]</w:t>
+              <w:t xml:space="preserve">0.0000</w:t>
             </w:r>
           </w:p>
         </w:tc>
@@ -1747,7 +1747,7 @@
                 <w:sz w:val="20"/>
                 <w:szCs w:val="20"/>
               </w:rPr>
-              <w:t xml:space="preserve">[X.XXXX]</w:t>
+              <w:t xml:space="preserve">0.0000</w:t>
             </w:r>
           </w:p>
         </w:tc>
@@ -1766,7 +1766,7 @@
                 <w:sz w:val="20"/>
                 <w:szCs w:val="20"/>
               </w:rPr>
-              <w:t xml:space="preserve">↑ (significant)</w:t>
+              <w:t xml:space="preserve">↑ (p = 0.307, n.s.)</w:t>
             </w:r>
           </w:p>
         </w:tc>
@@ -1787,7 +1787,7 @@
                 <w:sz w:val="20"/>
                 <w:szCs w:val="20"/>
               </w:rPr>
-              <w:t xml:space="preserve">hsa-let-7a-1</w:t>
+              <w:t xml:space="preserve">hsa-let-7a-3</w:t>
             </w:r>
           </w:p>
         </w:tc>
@@ -1806,7 +1806,7 @@
                 <w:sz w:val="20"/>
                 <w:szCs w:val="20"/>
               </w:rPr>
-              <w:t xml:space="preserve">[X.XXXX]</w:t>
+              <w:t xml:space="preserve">0.0000</w:t>
             </w:r>
           </w:p>
         </w:tc>
@@ -1825,7 +1825,7 @@
                 <w:sz w:val="20"/>
                 <w:szCs w:val="20"/>
               </w:rPr>
-              <w:t xml:space="preserve">[X.XXXX]</w:t>
+              <w:t xml:space="preserve">0.0000</w:t>
             </w:r>
           </w:p>
         </w:tc>
@@ -1844,7 +1844,7 @@
                 <w:sz w:val="20"/>
                 <w:szCs w:val="20"/>
               </w:rPr>
-              <w:t xml:space="preserve">↑ (approaching sig.)</w:t>
+              <w:t xml:space="preserve">↑ (p = 0.309, n.s.)</w:t>
             </w:r>
           </w:p>
         </w:tc>
@@ -1865,7 +1865,7 @@
                 <w:sz w:val="20"/>
                 <w:szCs w:val="20"/>
               </w:rPr>
-              <w:t xml:space="preserve">hsa-let-7a-2</w:t>
+              <w:t xml:space="preserve">hsa-let-7c</w:t>
             </w:r>
           </w:p>
         </w:tc>
@@ -1884,7 +1884,7 @@
                 <w:sz w:val="20"/>
                 <w:szCs w:val="20"/>
               </w:rPr>
-              <w:t xml:space="preserve">[X.XXXX]</w:t>
+              <w:t xml:space="preserve">0.0000</w:t>
             </w:r>
           </w:p>
         </w:tc>
@@ -1903,7 +1903,7 @@
                 <w:sz w:val="20"/>
                 <w:szCs w:val="20"/>
               </w:rPr>
-              <w:t xml:space="preserve">[X.XXXX]</w:t>
+              <w:t xml:space="preserve">0.0000</w:t>
             </w:r>
           </w:p>
         </w:tc>
@@ -1922,7 +1922,7 @@
                 <w:sz w:val="20"/>
                 <w:szCs w:val="20"/>
               </w:rPr>
-              <w:t xml:space="preserve">↑ (approaching sig.)</w:t>
+              <w:t xml:space="preserve">↓ (p = 0.363, n.s.)</w:t>
             </w:r>
           </w:p>
         </w:tc>
@@ -1943,7 +1943,7 @@
                 <w:sz w:val="20"/>
                 <w:szCs w:val="20"/>
               </w:rPr>
-              <w:t xml:space="preserve">hsa-let-7a-3</w:t>
+              <w:t xml:space="preserve">hsa-let-7d</w:t>
             </w:r>
           </w:p>
         </w:tc>
@@ -1962,7 +1962,7 @@
                 <w:sz w:val="20"/>
                 <w:szCs w:val="20"/>
               </w:rPr>
-              <w:t xml:space="preserve">[X.XXXX]</w:t>
+              <w:t xml:space="preserve">0.0000</w:t>
             </w:r>
           </w:p>
         </w:tc>
@@ -1981,7 +1981,7 @@
                 <w:sz w:val="20"/>
                 <w:szCs w:val="20"/>
               </w:rPr>
-              <w:t xml:space="preserve">[X.XXXX]</w:t>
+              <w:t xml:space="preserve">0.0000</w:t>
             </w:r>
           </w:p>
         </w:tc>
@@ -2000,7 +2000,7 @@
                 <w:sz w:val="20"/>
                 <w:szCs w:val="20"/>
               </w:rPr>
-              <w:t xml:space="preserve">↑ (approaching sig.)</w:t>
+              <w:t xml:space="preserve">↑ (p = 0.437, n.s.)</w:t>
             </w:r>
           </w:p>
         </w:tc>
@@ -2021,7 +2021,7 @@
                 <w:sz w:val="20"/>
                 <w:szCs w:val="20"/>
               </w:rPr>
-              <w:t xml:space="preserve">hsa-let-7d</w:t>
+              <w:t xml:space="preserve">hsa-let-7f-1</w:t>
             </w:r>
           </w:p>
         </w:tc>
@@ -2040,7 +2040,7 @@
                 <w:sz w:val="20"/>
                 <w:szCs w:val="20"/>
               </w:rPr>
-              <w:t xml:space="preserve">[X.XXXX]</w:t>
+              <w:t xml:space="preserve">0.0000</w:t>
             </w:r>
           </w:p>
         </w:tc>
@@ -2059,7 +2059,7 @@
                 <w:sz w:val="20"/>
                 <w:szCs w:val="20"/>
               </w:rPr>
-              <w:t xml:space="preserve">[X.XXXX]</w:t>
+              <w:t xml:space="preserve">0.0000</w:t>
             </w:r>
           </w:p>
         </w:tc>
@@ -2078,7 +2078,7 @@
                 <w:sz w:val="20"/>
                 <w:szCs w:val="20"/>
               </w:rPr>
-              <w:t xml:space="preserve">– (no change)</w:t>
+              <w:t xml:space="preserve">↑ (p = 0.121, n.s.)</w:t>
             </w:r>
           </w:p>
         </w:tc>
@@ -2099,7 +2099,7 @@
                 <w:sz w:val="20"/>
                 <w:szCs w:val="20"/>
               </w:rPr>
-              <w:t xml:space="preserve">hsa-let-7e</w:t>
+              <w:t xml:space="preserve">hsa-let-7f-2</w:t>
             </w:r>
           </w:p>
         </w:tc>
@@ -2118,7 +2118,7 @@
                 <w:sz w:val="20"/>
                 <w:szCs w:val="20"/>
               </w:rPr>
-              <w:t xml:space="preserve">[X.XXXX]</w:t>
+              <w:t xml:space="preserve">0.0000</w:t>
             </w:r>
           </w:p>
         </w:tc>
@@ -2137,7 +2137,7 @@
                 <w:sz w:val="20"/>
                 <w:szCs w:val="20"/>
               </w:rPr>
-              <w:t xml:space="preserve">[X.XXXX]</w:t>
+              <w:t xml:space="preserve">0.0000</w:t>
             </w:r>
           </w:p>
         </w:tc>
@@ -2156,7 +2156,7 @@
                 <w:sz w:val="20"/>
                 <w:szCs w:val="20"/>
               </w:rPr>
-              <w:t xml:space="preserve">↓ (significant)</w:t>
+              <w:t xml:space="preserve">↑ (p = 0.125, n.s.)</w:t>
             </w:r>
           </w:p>
         </w:tc>
@@ -2177,7 +2177,7 @@
                 <w:sz w:val="20"/>
                 <w:szCs w:val="20"/>
               </w:rPr>
-              <w:t xml:space="preserve">hsa-let-7c</w:t>
+              <w:t xml:space="preserve">hsa-let-7i</w:t>
             </w:r>
           </w:p>
         </w:tc>
@@ -2196,7 +2196,7 @@
                 <w:sz w:val="20"/>
                 <w:szCs w:val="20"/>
               </w:rPr>
-              <w:t xml:space="preserve">[X.XXXX]</w:t>
+              <w:t xml:space="preserve">0.0000</w:t>
             </w:r>
           </w:p>
         </w:tc>
@@ -2215,7 +2215,7 @@
                 <w:sz w:val="20"/>
                 <w:szCs w:val="20"/>
               </w:rPr>
-              <w:t xml:space="preserve">[X.XXXX]</w:t>
+              <w:t xml:space="preserve">0.0000</w:t>
             </w:r>
           </w:p>
         </w:tc>
@@ -2234,7 +2234,7 @@
                 <w:sz w:val="20"/>
                 <w:szCs w:val="20"/>
               </w:rPr>
-              <w:t xml:space="preserve">↓ (approaching sig.)</w:t>
+              <w:t xml:space="preserve">↑ (p = 3.13×10⁻⁵)</w:t>
             </w:r>
           </w:p>
         </w:tc>
@@ -2264,7 +2264,7 @@
           <w:sz w:val="24"/>
           <w:szCs w:val="24"/>
         </w:rPr>
-        <w:t xml:space="preserve">Let-7b was the most important feature, consistent with its largest fold change and lowest p-value in Study 1. Members with significant upregulation in ccRCC (let-7f-1, let-7f-2, let-7g, let-7i) also contributed positively. Let-7c and let-7e, which were downregulated in ccRCC, showed [low / moderate] importance, indicating that directionality of dysregulation does not fully predict feature utility in a multi-class context.</w:t>
+        <w:t xml:space="preserve">Let-7b was the most important feature (ΔROC-AUC = 0.069), consistent with its largest fold change (2.96×) and most significant upregulation among classifying features (p = 4.18 × 10⁻⁵) in the pilot dataset. Notably, let-7e—the most significantly downregulated member (fold change 0.40, p = 1.92 × 10⁻³)—was the second most important feature (ΔROC-AUC = 0.030), demonstrating that decreases in expression are also informative for classification. Let-7g contributed a small additional signal. The remaining members showed zero permutation importance on this 11-sample test set, reflecting the very small test partition rather than true irrelevance—these results will be more informative when evaluated on the complete 557-sample cohort.</w:t>
       </w:r>
     </w:p>
     <w:p>
@@ -2300,7 +2300,7 @@
           <w:sz w:val="24"/>
           <w:szCs w:val="24"/>
         </w:rPr>
-        <w:t xml:space="preserve">To assess whether the results on the small real test set (n = 112) generalise, we additionally performed stratified 5-fold cross-validation on the full dataset for each classifier. Because SMOTE cannot be applied inside a standard cross_val_score loop, these results serve as a qualitative check rather than the primary evaluation metric. CV ROC-AUC values (mean ± SD across five folds) were: SVM-RBF [X.XXX ± X.XXX], Logistic Regression [X.XXX ± X.XXX], Random Forest [X.XXX ± X.XXX], consistent with the held-out test set results.</w:t>
+        <w:t xml:space="preserve">To assess robustness on the pilot dataset, we performed stratified 5-fold cross-validation on all 52 samples for each classifier (SMOTE not applied inside folds; qualitative check only). CV ROC-AUC (mean ± SD): single-feature SVM 0.838 ± 0.200, indicating that the perfect held-out AUC reflects the small test set size. Full cross-validation results for the multi-feature classifiers on the complete 557-sample cohort will provide a more reliable estimate.</w:t>
       </w:r>
     </w:p>
     <w:p>

</xml_diff>